<commit_message>
Match review Word formatting to online copy
</commit_message>
<xml_diff>
--- a/When_Perfect_Is_Wrong_Review_Copy.docx
+++ b/When_Perfect_Is_Wrong_Review_Copy.docx
@@ -233,8 +233,6 @@
             <w:r>
               <w:rPr>
                 <w:b/>
-                <w:sz w:val="20"/>
-                <w:szCs w:val="20"/>
               </w:rPr>
               <w:t>Dataset</w:t>
             </w:r>
@@ -248,8 +246,6 @@
             <w:r>
               <w:rPr>
                 <w:b/>
-                <w:sz w:val="20"/>
-                <w:szCs w:val="20"/>
               </w:rPr>
               <w:t>N</w:t>
             </w:r>
@@ -263,8 +259,6 @@
             <w:r>
               <w:rPr>
                 <w:b/>
-                <w:sz w:val="20"/>
-                <w:szCs w:val="20"/>
               </w:rPr>
               <w:t>Origin</w:t>
             </w:r>
@@ -278,8 +272,6 @@
             <w:r>
               <w:rPr>
                 <w:b/>
-                <w:sz w:val="20"/>
-                <w:szCs w:val="20"/>
               </w:rPr>
               <w:t>CKD label</w:t>
             </w:r>
@@ -293,8 +285,6 @@
             <w:r>
               <w:rPr>
                 <w:b/>
-                <w:sz w:val="20"/>
-                <w:szCs w:val="20"/>
               </w:rPr>
               <w:t>Key features</w:t>
             </w:r>
@@ -308,10 +298,6 @@
           </w:tcPr>
           <w:p>
             <w:r>
-              <w:rPr>
-                <w:sz w:val="20"/>
-                <w:szCs w:val="20"/>
-              </w:rPr>
               <w:t>UCI CKD</w:t>
             </w:r>
           </w:p>
@@ -322,10 +308,6 @@
           </w:tcPr>
           <w:p>
             <w:r>
-              <w:rPr>
-                <w:sz w:val="20"/>
-                <w:szCs w:val="20"/>
-              </w:rPr>
               <w:t>400</w:t>
             </w:r>
           </w:p>
@@ -336,10 +318,6 @@
           </w:tcPr>
           <w:p>
             <w:r>
-              <w:rPr>
-                <w:sz w:val="20"/>
-                <w:szCs w:val="20"/>
-              </w:rPr>
               <w:t>India hospital EHR</w:t>
             </w:r>
           </w:p>
@@ -350,10 +328,6 @@
           </w:tcPr>
           <w:p>
             <w:r>
-              <w:rPr>
-                <w:sz w:val="20"/>
-                <w:szCs w:val="20"/>
-              </w:rPr>
               <w:t>Physician diagnosis, prevalent CKD</w:t>
             </w:r>
           </w:p>
@@ -364,10 +338,6 @@
           </w:tcPr>
           <w:p>
             <w:r>
-              <w:rPr>
-                <w:sz w:val="20"/>
-                <w:szCs w:val="20"/>
-              </w:rPr>
               <w:t>Hemoglobin, specific gravity, creatinine, packed cell volume, albumin</w:t>
             </w:r>
           </w:p>
@@ -380,10 +350,6 @@
           </w:tcPr>
           <w:p>
             <w:r>
-              <w:rPr>
-                <w:sz w:val="20"/>
-                <w:szCs w:val="20"/>
-              </w:rPr>
               <w:t>NHANES 2021–2023</w:t>
             </w:r>
           </w:p>
@@ -394,10 +360,6 @@
           </w:tcPr>
           <w:p>
             <w:r>
-              <w:rPr>
-                <w:sz w:val="20"/>
-                <w:szCs w:val="20"/>
-              </w:rPr>
               <w:t>11,933</w:t>
             </w:r>
           </w:p>
@@ -408,10 +370,6 @@
           </w:tcPr>
           <w:p>
             <w:r>
-              <w:rPr>
-                <w:sz w:val="20"/>
-                <w:szCs w:val="20"/>
-              </w:rPr>
               <w:t>U.S. national health survey</w:t>
             </w:r>
           </w:p>
@@ -422,10 +380,6 @@
           </w:tcPr>
           <w:p>
             <w:r>
-              <w:rPr>
-                <w:sz w:val="20"/>
-                <w:szCs w:val="20"/>
-              </w:rPr>
               <w:t>eGFR &lt;60 or ACR ≥ 30</w:t>
             </w:r>
           </w:p>
@@ -436,10 +390,6 @@
           </w:tcPr>
           <w:p>
             <w:r>
-              <w:rPr>
-                <w:sz w:val="20"/>
-                <w:szCs w:val="20"/>
-              </w:rPr>
               <w:t>Creatinine, BUN, albumin, BMI, eGFR, ACR, diabetes, blood pressure</w:t>
             </w:r>
           </w:p>
@@ -452,10 +402,6 @@
           </w:tcPr>
           <w:p>
             <w:r>
-              <w:rPr>
-                <w:sz w:val="20"/>
-                <w:szCs w:val="20"/>
-              </w:rPr>
               <w:t>Tawam Hospital UAE</w:t>
             </w:r>
           </w:p>
@@ -466,10 +412,6 @@
           </w:tcPr>
           <w:p>
             <w:r>
-              <w:rPr>
-                <w:sz w:val="20"/>
-                <w:szCs w:val="20"/>
-              </w:rPr>
               <w:t>491</w:t>
             </w:r>
           </w:p>
@@ -480,10 +422,6 @@
           </w:tcPr>
           <w:p>
             <w:r>
-              <w:rPr>
-                <w:sz w:val="20"/>
-                <w:szCs w:val="20"/>
-              </w:rPr>
               <w:t>Abu Dhabi EHR</w:t>
             </w:r>
           </w:p>
@@ -494,10 +432,6 @@
           </w:tcPr>
           <w:p>
             <w:r>
-              <w:rPr>
-                <w:sz w:val="20"/>
-                <w:szCs w:val="20"/>
-              </w:rPr>
               <w:t>8-year CKD progression</w:t>
             </w:r>
           </w:p>
@@ -508,10 +442,6 @@
           </w:tcPr>
           <w:p>
             <w:r>
-              <w:rPr>
-                <w:sz w:val="20"/>
-                <w:szCs w:val="20"/>
-              </w:rPr>
               <w:t>Creatinine, eGFR, HbA1c, cholesterol, triglycerides, blood pressure, BMI</w:t>
             </w:r>
           </w:p>
@@ -561,8 +491,6 @@
             <w:r>
               <w:rPr>
                 <w:b/>
-                <w:sz w:val="20"/>
-                <w:szCs w:val="20"/>
               </w:rPr>
               <w:t>Dataset</w:t>
             </w:r>
@@ -576,8 +504,6 @@
             <w:r>
               <w:rPr>
                 <w:b/>
-                <w:sz w:val="20"/>
-                <w:szCs w:val="20"/>
               </w:rPr>
               <w:t>CKD stages represented</w:t>
             </w:r>
@@ -591,8 +517,6 @@
             <w:r>
               <w:rPr>
                 <w:b/>
-                <w:sz w:val="20"/>
-                <w:szCs w:val="20"/>
               </w:rPr>
               <w:t>Stages excluded</w:t>
             </w:r>
@@ -606,8 +530,6 @@
             <w:r>
               <w:rPr>
                 <w:b/>
-                <w:sz w:val="20"/>
-                <w:szCs w:val="20"/>
               </w:rPr>
               <w:t>Population setting</w:t>
             </w:r>
@@ -621,10 +543,6 @@
           </w:tcPr>
           <w:p>
             <w:r>
-              <w:rPr>
-                <w:sz w:val="20"/>
-                <w:szCs w:val="20"/>
-              </w:rPr>
               <w:t>UCI CKD</w:t>
             </w:r>
           </w:p>
@@ -635,10 +553,6 @@
           </w:tcPr>
           <w:p>
             <w:r>
-              <w:rPr>
-                <w:sz w:val="20"/>
-                <w:szCs w:val="20"/>
-              </w:rPr>
               <w:t>Primarily G3b–G5 among cases</w:t>
             </w:r>
           </w:p>
@@ -649,10 +563,6 @@
           </w:tcPr>
           <w:p>
             <w:r>
-              <w:rPr>
-                <w:sz w:val="20"/>
-                <w:szCs w:val="20"/>
-              </w:rPr>
               <w:t>G1–G3a largely absent</w:t>
             </w:r>
           </w:p>
@@ -663,10 +573,6 @@
           </w:tcPr>
           <w:p>
             <w:r>
-              <w:rPr>
-                <w:sz w:val="20"/>
-                <w:szCs w:val="20"/>
-              </w:rPr>
               <w:t>Hospital outpatients/inpatients</w:t>
             </w:r>
           </w:p>
@@ -679,10 +585,6 @@
           </w:tcPr>
           <w:p>
             <w:r>
-              <w:rPr>
-                <w:sz w:val="20"/>
-                <w:szCs w:val="20"/>
-              </w:rPr>
               <w:t>NHANES 2021–2023</w:t>
             </w:r>
           </w:p>
@@ -693,10 +595,6 @@
           </w:tcPr>
           <w:p>
             <w:r>
-              <w:rPr>
-                <w:sz w:val="20"/>
-                <w:szCs w:val="20"/>
-              </w:rPr>
               <w:t>G1–G5 by eGFR/ACR criteria</w:t>
             </w:r>
           </w:p>
@@ -707,10 +605,6 @@
           </w:tcPr>
           <w:p>
             <w:r>
-              <w:rPr>
-                <w:sz w:val="20"/>
-                <w:szCs w:val="20"/>
-              </w:rPr>
               <w:t>None by definition</w:t>
             </w:r>
           </w:p>
@@ -721,10 +615,6 @@
           </w:tcPr>
           <w:p>
             <w:r>
-              <w:rPr>
-                <w:sz w:val="20"/>
-                <w:szCs w:val="20"/>
-              </w:rPr>
               <w:t>U.S. community-dwelling sample</w:t>
             </w:r>
           </w:p>
@@ -737,10 +627,6 @@
           </w:tcPr>
           <w:p>
             <w:r>
-              <w:rPr>
-                <w:sz w:val="20"/>
-                <w:szCs w:val="20"/>
-              </w:rPr>
               <w:t>Tawam Hospital UAE</w:t>
             </w:r>
           </w:p>
@@ -751,10 +637,6 @@
           </w:tcPr>
           <w:p>
             <w:r>
-              <w:rPr>
-                <w:sz w:val="20"/>
-                <w:szCs w:val="20"/>
-              </w:rPr>
               <w:t>Baseline G1–G2; progression toward ≤G3b</w:t>
             </w:r>
           </w:p>
@@ -765,10 +647,6 @@
           </w:tcPr>
           <w:p>
             <w:r>
-              <w:rPr>
-                <w:sz w:val="20"/>
-                <w:szCs w:val="20"/>
-              </w:rPr>
               <w:t>G4–G5 at baseline excluded</w:t>
             </w:r>
           </w:p>
@@ -779,10 +657,6 @@
           </w:tcPr>
           <w:p>
             <w:r>
-              <w:rPr>
-                <w:sz w:val="20"/>
-                <w:szCs w:val="20"/>
-              </w:rPr>
               <w:t>Hospital cardiology cohort</w:t>
             </w:r>
           </w:p>
@@ -819,8 +693,6 @@
             <w:r>
               <w:rPr>
                 <w:b/>
-                <w:sz w:val="20"/>
-                <w:szCs w:val="20"/>
               </w:rPr>
               <w:t>Dataset</w:t>
             </w:r>
@@ -834,8 +706,6 @@
             <w:r>
               <w:rPr>
                 <w:b/>
-                <w:sz w:val="20"/>
-                <w:szCs w:val="20"/>
               </w:rPr>
               <w:t>N</w:t>
             </w:r>
@@ -849,8 +719,6 @@
             <w:r>
               <w:rPr>
                 <w:b/>
-                <w:sz w:val="20"/>
-                <w:szCs w:val="20"/>
               </w:rPr>
               <w:t>Pos.</w:t>
             </w:r>
@@ -864,8 +732,6 @@
             <w:r>
               <w:rPr>
                 <w:b/>
-                <w:sz w:val="20"/>
-                <w:szCs w:val="20"/>
               </w:rPr>
               <w:t>Pos. rate</w:t>
             </w:r>
@@ -879,8 +745,6 @@
             <w:r>
               <w:rPr>
                 <w:b/>
-                <w:sz w:val="20"/>
-                <w:szCs w:val="20"/>
               </w:rPr>
               <w:t>Pred.</w:t>
             </w:r>
@@ -894,8 +758,6 @@
             <w:r>
               <w:rPr>
                 <w:b/>
-                <w:sz w:val="20"/>
-                <w:szCs w:val="20"/>
               </w:rPr>
               <w:t>Miss.</w:t>
             </w:r>
@@ -909,8 +771,6 @@
             <w:r>
               <w:rPr>
                 <w:b/>
-                <w:sz w:val="20"/>
-                <w:szCs w:val="20"/>
               </w:rPr>
               <w:t>Train N</w:t>
             </w:r>
@@ -924,8 +784,6 @@
             <w:r>
               <w:rPr>
                 <w:b/>
-                <w:sz w:val="20"/>
-                <w:szCs w:val="20"/>
               </w:rPr>
               <w:t>Train pos.</w:t>
             </w:r>
@@ -939,8 +797,6 @@
             <w:r>
               <w:rPr>
                 <w:b/>
-                <w:sz w:val="20"/>
-                <w:szCs w:val="20"/>
               </w:rPr>
               <w:t>Test N</w:t>
             </w:r>
@@ -954,8 +810,6 @@
             <w:r>
               <w:rPr>
                 <w:b/>
-                <w:sz w:val="20"/>
-                <w:szCs w:val="20"/>
               </w:rPr>
               <w:t>Test pos.</w:t>
             </w:r>
@@ -969,8 +823,6 @@
             <w:r>
               <w:rPr>
                 <w:b/>
-                <w:sz w:val="20"/>
-                <w:szCs w:val="20"/>
               </w:rPr>
               <w:t>Dup. IDs</w:t>
             </w:r>
@@ -984,10 +836,6 @@
           </w:tcPr>
           <w:p>
             <w:r>
-              <w:rPr>
-                <w:sz w:val="20"/>
-                <w:szCs w:val="20"/>
-              </w:rPr>
               <w:t>UCI CKD</w:t>
             </w:r>
           </w:p>
@@ -998,10 +846,6 @@
           </w:tcPr>
           <w:p>
             <w:r>
-              <w:rPr>
-                <w:sz w:val="20"/>
-                <w:szCs w:val="20"/>
-              </w:rPr>
               <w:t>400</w:t>
             </w:r>
           </w:p>
@@ -1012,10 +856,6 @@
           </w:tcPr>
           <w:p>
             <w:r>
-              <w:rPr>
-                <w:sz w:val="20"/>
-                <w:szCs w:val="20"/>
-              </w:rPr>
               <w:t>250</w:t>
             </w:r>
           </w:p>
@@ -1026,10 +866,6 @@
           </w:tcPr>
           <w:p>
             <w:r>
-              <w:rPr>
-                <w:sz w:val="20"/>
-                <w:szCs w:val="20"/>
-              </w:rPr>
               <w:t>0.625</w:t>
             </w:r>
           </w:p>
@@ -1040,10 +876,6 @@
           </w:tcPr>
           <w:p>
             <w:r>
-              <w:rPr>
-                <w:sz w:val="20"/>
-                <w:szCs w:val="20"/>
-              </w:rPr>
               <w:t>24</w:t>
             </w:r>
           </w:p>
@@ -1054,10 +886,6 @@
           </w:tcPr>
           <w:p>
             <w:r>
-              <w:rPr>
-                <w:sz w:val="20"/>
-                <w:szCs w:val="20"/>
-              </w:rPr>
               <w:t>1,012</w:t>
             </w:r>
           </w:p>
@@ -1068,10 +896,6 @@
           </w:tcPr>
           <w:p>
             <w:r>
-              <w:rPr>
-                <w:sz w:val="20"/>
-                <w:szCs w:val="20"/>
-              </w:rPr>
               <w:t>300</w:t>
             </w:r>
           </w:p>
@@ -1082,10 +906,6 @@
           </w:tcPr>
           <w:p>
             <w:r>
-              <w:rPr>
-                <w:sz w:val="20"/>
-                <w:szCs w:val="20"/>
-              </w:rPr>
               <w:t>0.627</w:t>
             </w:r>
           </w:p>
@@ -1096,10 +916,6 @@
           </w:tcPr>
           <w:p>
             <w:r>
-              <w:rPr>
-                <w:sz w:val="20"/>
-                <w:szCs w:val="20"/>
-              </w:rPr>
               <w:t>100</w:t>
             </w:r>
           </w:p>
@@ -1110,10 +926,6 @@
           </w:tcPr>
           <w:p>
             <w:r>
-              <w:rPr>
-                <w:sz w:val="20"/>
-                <w:szCs w:val="20"/>
-              </w:rPr>
               <w:t>0.620</w:t>
             </w:r>
           </w:p>
@@ -1124,10 +936,6 @@
           </w:tcPr>
           <w:p>
             <w:r>
-              <w:rPr>
-                <w:sz w:val="20"/>
-                <w:szCs w:val="20"/>
-              </w:rPr>
               <w:t>0</w:t>
             </w:r>
           </w:p>
@@ -1140,10 +948,6 @@
           </w:tcPr>
           <w:p>
             <w:r>
-              <w:rPr>
-                <w:sz w:val="20"/>
-                <w:szCs w:val="20"/>
-              </w:rPr>
               <w:t>NHANES 2021–2023</w:t>
             </w:r>
           </w:p>
@@ -1154,10 +958,6 @@
           </w:tcPr>
           <w:p>
             <w:r>
-              <w:rPr>
-                <w:sz w:val="20"/>
-                <w:szCs w:val="20"/>
-              </w:rPr>
               <w:t>11,933</w:t>
             </w:r>
           </w:p>
@@ -1168,10 +968,6 @@
           </w:tcPr>
           <w:p>
             <w:r>
-              <w:rPr>
-                <w:sz w:val="20"/>
-                <w:szCs w:val="20"/>
-              </w:rPr>
               <w:t>8,341</w:t>
             </w:r>
           </w:p>
@@ -1182,10 +978,6 @@
           </w:tcPr>
           <w:p>
             <w:r>
-              <w:rPr>
-                <w:sz w:val="20"/>
-                <w:szCs w:val="20"/>
-              </w:rPr>
               <w:t>0.699</w:t>
             </w:r>
           </w:p>
@@ -1196,10 +988,6 @@
           </w:tcPr>
           <w:p>
             <w:r>
-              <w:rPr>
-                <w:sz w:val="20"/>
-                <w:szCs w:val="20"/>
-              </w:rPr>
               <w:t>11</w:t>
             </w:r>
           </w:p>
@@ -1210,10 +998,6 @@
           </w:tcPr>
           <w:p>
             <w:r>
-              <w:rPr>
-                <w:sz w:val="20"/>
-                <w:szCs w:val="20"/>
-              </w:rPr>
               <w:t>38,655</w:t>
             </w:r>
           </w:p>
@@ -1224,10 +1008,6 @@
           </w:tcPr>
           <w:p>
             <w:r>
-              <w:rPr>
-                <w:sz w:val="20"/>
-                <w:szCs w:val="20"/>
-              </w:rPr>
               <w:t>10,143</w:t>
             </w:r>
           </w:p>
@@ -1238,10 +1018,6 @@
           </w:tcPr>
           <w:p>
             <w:r>
-              <w:rPr>
-                <w:sz w:val="20"/>
-                <w:szCs w:val="20"/>
-              </w:rPr>
               <w:t>0.699</w:t>
             </w:r>
           </w:p>
@@ -1252,10 +1028,6 @@
           </w:tcPr>
           <w:p>
             <w:r>
-              <w:rPr>
-                <w:sz w:val="20"/>
-                <w:szCs w:val="20"/>
-              </w:rPr>
               <w:t>1,790</w:t>
             </w:r>
           </w:p>
@@ -1266,10 +1038,6 @@
           </w:tcPr>
           <w:p>
             <w:r>
-              <w:rPr>
-                <w:sz w:val="20"/>
-                <w:szCs w:val="20"/>
-              </w:rPr>
               <w:t>0.699</w:t>
             </w:r>
           </w:p>
@@ -1280,10 +1048,6 @@
           </w:tcPr>
           <w:p>
             <w:r>
-              <w:rPr>
-                <w:sz w:val="20"/>
-                <w:szCs w:val="20"/>
-              </w:rPr>
               <w:t>0</w:t>
             </w:r>
           </w:p>
@@ -1296,10 +1060,6 @@
           </w:tcPr>
           <w:p>
             <w:r>
-              <w:rPr>
-                <w:sz w:val="20"/>
-                <w:szCs w:val="20"/>
-              </w:rPr>
               <w:t>Tawam UAE</w:t>
             </w:r>
           </w:p>
@@ -1310,10 +1070,6 @@
           </w:tcPr>
           <w:p>
             <w:r>
-              <w:rPr>
-                <w:sz w:val="20"/>
-                <w:szCs w:val="20"/>
-              </w:rPr>
               <w:t>491</w:t>
             </w:r>
           </w:p>
@@ -1324,10 +1080,6 @@
           </w:tcPr>
           <w:p>
             <w:r>
-              <w:rPr>
-                <w:sz w:val="20"/>
-                <w:szCs w:val="20"/>
-              </w:rPr>
               <w:t>56</w:t>
             </w:r>
           </w:p>
@@ -1338,10 +1090,6 @@
           </w:tcPr>
           <w:p>
             <w:r>
-              <w:rPr>
-                <w:sz w:val="20"/>
-                <w:szCs w:val="20"/>
-              </w:rPr>
               <w:t>0.114</w:t>
             </w:r>
           </w:p>
@@ -1352,10 +1100,6 @@
           </w:tcPr>
           <w:p>
             <w:r>
-              <w:rPr>
-                <w:sz w:val="20"/>
-                <w:szCs w:val="20"/>
-              </w:rPr>
               <w:t>10</w:t>
             </w:r>
           </w:p>
@@ -1366,10 +1110,6 @@
           </w:tcPr>
           <w:p>
             <w:r>
-              <w:rPr>
-                <w:sz w:val="20"/>
-                <w:szCs w:val="20"/>
-              </w:rPr>
               <w:t>21</w:t>
             </w:r>
           </w:p>
@@ -1380,10 +1120,6 @@
           </w:tcPr>
           <w:p>
             <w:r>
-              <w:rPr>
-                <w:sz w:val="20"/>
-                <w:szCs w:val="20"/>
-              </w:rPr>
               <w:t>368</w:t>
             </w:r>
           </w:p>
@@ -1394,10 +1130,6 @@
           </w:tcPr>
           <w:p>
             <w:r>
-              <w:rPr>
-                <w:sz w:val="20"/>
-                <w:szCs w:val="20"/>
-              </w:rPr>
               <w:t>0.114</w:t>
             </w:r>
           </w:p>
@@ -1408,10 +1140,6 @@
           </w:tcPr>
           <w:p>
             <w:r>
-              <w:rPr>
-                <w:sz w:val="20"/>
-                <w:szCs w:val="20"/>
-              </w:rPr>
               <w:t>123</w:t>
             </w:r>
           </w:p>
@@ -1422,10 +1150,6 @@
           </w:tcPr>
           <w:p>
             <w:r>
-              <w:rPr>
-                <w:sz w:val="20"/>
-                <w:szCs w:val="20"/>
-              </w:rPr>
               <w:t>0.114</w:t>
             </w:r>
           </w:p>
@@ -1436,10 +1160,6 @@
           </w:tcPr>
           <w:p>
             <w:r>
-              <w:rPr>
-                <w:sz w:val="20"/>
-                <w:szCs w:val="20"/>
-              </w:rPr>
               <w:t>0</w:t>
             </w:r>
           </w:p>
@@ -1551,8 +1271,6 @@
             <w:r>
               <w:rPr>
                 <w:b/>
-                <w:sz w:val="20"/>
-                <w:szCs w:val="20"/>
               </w:rPr>
               <w:t>Model</w:t>
             </w:r>
@@ -1566,8 +1284,6 @@
             <w:r>
               <w:rPr>
                 <w:b/>
-                <w:sz w:val="20"/>
-                <w:szCs w:val="20"/>
               </w:rPr>
               <w:t>Family</w:t>
             </w:r>
@@ -1581,8 +1297,6 @@
             <w:r>
               <w:rPr>
                 <w:b/>
-                <w:sz w:val="20"/>
-                <w:szCs w:val="20"/>
               </w:rPr>
               <w:t>Key hyperparameters</w:t>
             </w:r>
@@ -1596,8 +1310,6 @@
             <w:r>
               <w:rPr>
                 <w:b/>
-                <w:sz w:val="20"/>
-                <w:szCs w:val="20"/>
               </w:rPr>
               <w:t>Role</w:t>
             </w:r>
@@ -1611,10 +1323,6 @@
           </w:tcPr>
           <w:p>
             <w:r>
-              <w:rPr>
-                <w:sz w:val="20"/>
-                <w:szCs w:val="20"/>
-              </w:rPr>
               <w:t>Logistic Regression</w:t>
             </w:r>
           </w:p>
@@ -1625,10 +1333,6 @@
           </w:tcPr>
           <w:p>
             <w:r>
-              <w:rPr>
-                <w:sz w:val="20"/>
-                <w:szCs w:val="20"/>
-              </w:rPr>
               <w:t>Linear</w:t>
             </w:r>
           </w:p>
@@ -1639,10 +1343,6 @@
           </w:tcPr>
           <w:p>
             <w:r>
-              <w:rPr>
-                <w:sz w:val="20"/>
-                <w:szCs w:val="20"/>
-              </w:rPr>
               <w:t>C=1.0, max_iter=1000</w:t>
             </w:r>
           </w:p>
@@ -1653,10 +1353,6 @@
           </w:tcPr>
           <w:p>
             <w:r>
-              <w:rPr>
-                <w:sz w:val="20"/>
-                <w:szCs w:val="20"/>
-              </w:rPr>
               <w:t>Interpretable baseline</w:t>
             </w:r>
           </w:p>
@@ -1669,10 +1365,6 @@
           </w:tcPr>
           <w:p>
             <w:r>
-              <w:rPr>
-                <w:sz w:val="20"/>
-                <w:szCs w:val="20"/>
-              </w:rPr>
               <w:t>Random Forest</w:t>
             </w:r>
           </w:p>
@@ -1683,10 +1375,6 @@
           </w:tcPr>
           <w:p>
             <w:r>
-              <w:rPr>
-                <w:sz w:val="20"/>
-                <w:szCs w:val="20"/>
-              </w:rPr>
               <w:t>Bagging ensemble</w:t>
             </w:r>
           </w:p>
@@ -1697,10 +1385,6 @@
           </w:tcPr>
           <w:p>
             <w:r>
-              <w:rPr>
-                <w:sz w:val="20"/>
-                <w:szCs w:val="20"/>
-              </w:rPr>
               <w:t>200 trees, depth 8, minimum leaf 5</w:t>
             </w:r>
           </w:p>
@@ -1711,10 +1395,6 @@
           </w:tcPr>
           <w:p>
             <w:r>
-              <w:rPr>
-                <w:sz w:val="20"/>
-                <w:szCs w:val="20"/>
-              </w:rPr>
               <w:t>Nonlinear baseline</w:t>
             </w:r>
           </w:p>
@@ -1727,10 +1407,6 @@
           </w:tcPr>
           <w:p>
             <w:r>
-              <w:rPr>
-                <w:sz w:val="20"/>
-                <w:szCs w:val="20"/>
-              </w:rPr>
               <w:t>Gradient Boosting</w:t>
             </w:r>
           </w:p>
@@ -1741,10 +1417,6 @@
           </w:tcPr>
           <w:p>
             <w:r>
-              <w:rPr>
-                <w:sz w:val="20"/>
-                <w:szCs w:val="20"/>
-              </w:rPr>
               <w:t>Boosting ensemble</w:t>
             </w:r>
           </w:p>
@@ -1755,10 +1427,6 @@
           </w:tcPr>
           <w:p>
             <w:r>
-              <w:rPr>
-                <w:sz w:val="20"/>
-                <w:szCs w:val="20"/>
-              </w:rPr>
               <w:t>300 iterations, learning rate 0.05, depth 5</w:t>
             </w:r>
           </w:p>
@@ -1769,10 +1437,6 @@
           </w:tcPr>
           <w:p>
             <w:r>
-              <w:rPr>
-                <w:sz w:val="20"/>
-                <w:szCs w:val="20"/>
-              </w:rPr>
               <w:t>Primary learning-curve model</w:t>
             </w:r>
           </w:p>
@@ -1785,10 +1449,6 @@
           </w:tcPr>
           <w:p>
             <w:r>
-              <w:rPr>
-                <w:sz w:val="20"/>
-                <w:szCs w:val="20"/>
-              </w:rPr>
               <w:t>Neural Network (MLP)</w:t>
             </w:r>
           </w:p>
@@ -1799,10 +1459,6 @@
           </w:tcPr>
           <w:p>
             <w:r>
-              <w:rPr>
-                <w:sz w:val="20"/>
-                <w:szCs w:val="20"/>
-              </w:rPr>
               <w:t>Deep learning</w:t>
             </w:r>
           </w:p>
@@ -1813,10 +1469,6 @@
           </w:tcPr>
           <w:p>
             <w:r>
-              <w:rPr>
-                <w:sz w:val="20"/>
-                <w:szCs w:val="20"/>
-              </w:rPr>
               <w:t>128–64–32 hidden units, early stopping</w:t>
             </w:r>
           </w:p>
@@ -1827,10 +1479,6 @@
           </w:tcPr>
           <w:p>
             <w:r>
-              <w:rPr>
-                <w:sz w:val="20"/>
-                <w:szCs w:val="20"/>
-              </w:rPr>
               <w:t>Flexible nonlinear model</w:t>
             </w:r>
           </w:p>
@@ -1843,10 +1491,6 @@
           </w:tcPr>
           <w:p>
             <w:r>
-              <w:rPr>
-                <w:sz w:val="20"/>
-                <w:szCs w:val="20"/>
-              </w:rPr>
               <w:t>Soft-voting Ensemble</w:t>
             </w:r>
           </w:p>
@@ -1857,10 +1501,6 @@
           </w:tcPr>
           <w:p>
             <w:r>
-              <w:rPr>
-                <w:sz w:val="20"/>
-                <w:szCs w:val="20"/>
-              </w:rPr>
               <w:t>HGB + RF + MLP</w:t>
             </w:r>
           </w:p>
@@ -1871,10 +1511,6 @@
           </w:tcPr>
           <w:p>
             <w:r>
-              <w:rPr>
-                <w:sz w:val="20"/>
-                <w:szCs w:val="20"/>
-              </w:rPr>
               <w:t>Soft voting over three base learners</w:t>
             </w:r>
           </w:p>
@@ -1885,10 +1521,6 @@
           </w:tcPr>
           <w:p>
             <w:r>
-              <w:rPr>
-                <w:sz w:val="20"/>
-                <w:szCs w:val="20"/>
-              </w:rPr>
               <w:t>Aggregate benchmark</w:t>
             </w:r>
           </w:p>
@@ -1986,8 +1618,6 @@
             <w:r>
               <w:rPr>
                 <w:b/>
-                <w:sz w:val="20"/>
-                <w:szCs w:val="20"/>
               </w:rPr>
               <w:t>Model</w:t>
             </w:r>
@@ -2001,8 +1631,6 @@
             <w:r>
               <w:rPr>
                 <w:b/>
-                <w:sz w:val="20"/>
-                <w:szCs w:val="20"/>
               </w:rPr>
               <w:t>UCI AUC</w:t>
             </w:r>
@@ -2016,8 +1644,6 @@
             <w:r>
               <w:rPr>
                 <w:b/>
-                <w:sz w:val="20"/>
-                <w:szCs w:val="20"/>
               </w:rPr>
               <w:t>NHANES AUC</w:t>
             </w:r>
@@ -2031,8 +1657,6 @@
             <w:r>
               <w:rPr>
                 <w:b/>
-                <w:sz w:val="20"/>
-                <w:szCs w:val="20"/>
               </w:rPr>
               <w:t>Tawam AUC</w:t>
             </w:r>
@@ -2046,8 +1670,6 @@
             <w:r>
               <w:rPr>
                 <w:b/>
-                <w:sz w:val="20"/>
-                <w:szCs w:val="20"/>
               </w:rPr>
               <w:t>NHANES Brier</w:t>
             </w:r>
@@ -2061,8 +1683,6 @@
             <w:r>
               <w:rPr>
                 <w:b/>
-                <w:sz w:val="20"/>
-                <w:szCs w:val="20"/>
               </w:rPr>
               <w:t>Tawam Brier</w:t>
             </w:r>
@@ -2076,10 +1696,6 @@
           </w:tcPr>
           <w:p>
             <w:r>
-              <w:rPr>
-                <w:sz w:val="20"/>
-                <w:szCs w:val="20"/>
-              </w:rPr>
               <w:t>LogReg</w:t>
             </w:r>
           </w:p>
@@ -2090,10 +1706,6 @@
           </w:tcPr>
           <w:p>
             <w:r>
-              <w:rPr>
-                <w:sz w:val="20"/>
-                <w:szCs w:val="20"/>
-              </w:rPr>
               <w:t>1.0000</w:t>
             </w:r>
           </w:p>
@@ -2104,10 +1716,6 @@
           </w:tcPr>
           <w:p>
             <w:r>
-              <w:rPr>
-                <w:sz w:val="20"/>
-                <w:szCs w:val="20"/>
-              </w:rPr>
               <w:t>0.9457</w:t>
             </w:r>
           </w:p>
@@ -2118,10 +1726,6 @@
           </w:tcPr>
           <w:p>
             <w:r>
-              <w:rPr>
-                <w:sz w:val="20"/>
-                <w:szCs w:val="20"/>
-              </w:rPr>
               <w:t>0.8768</w:t>
             </w:r>
           </w:p>
@@ -2132,10 +1736,6 @@
           </w:tcPr>
           <w:p>
             <w:r>
-              <w:rPr>
-                <w:sz w:val="20"/>
-                <w:szCs w:val="20"/>
-              </w:rPr>
               <w:t>0.0835</w:t>
             </w:r>
           </w:p>
@@ -2146,10 +1746,6 @@
           </w:tcPr>
           <w:p>
             <w:r>
-              <w:rPr>
-                <w:sz w:val="20"/>
-                <w:szCs w:val="20"/>
-              </w:rPr>
               <w:t>0.0612</w:t>
             </w:r>
           </w:p>
@@ -2162,10 +1758,6 @@
           </w:tcPr>
           <w:p>
             <w:r>
-              <w:rPr>
-                <w:sz w:val="20"/>
-                <w:szCs w:val="20"/>
-              </w:rPr>
               <w:t>RF</w:t>
             </w:r>
           </w:p>
@@ -2176,10 +1768,6 @@
           </w:tcPr>
           <w:p>
             <w:r>
-              <w:rPr>
-                <w:sz w:val="20"/>
-                <w:szCs w:val="20"/>
-              </w:rPr>
               <w:t>0.9996</w:t>
             </w:r>
           </w:p>
@@ -2190,10 +1778,6 @@
           </w:tcPr>
           <w:p>
             <w:r>
-              <w:rPr>
-                <w:sz w:val="20"/>
-                <w:szCs w:val="20"/>
-              </w:rPr>
               <w:t>1.0000</w:t>
             </w:r>
           </w:p>
@@ -2204,10 +1788,6 @@
           </w:tcPr>
           <w:p>
             <w:r>
-              <w:rPr>
-                <w:sz w:val="20"/>
-                <w:szCs w:val="20"/>
-              </w:rPr>
               <w:t>0.9083</w:t>
             </w:r>
           </w:p>
@@ -2218,10 +1798,6 @@
           </w:tcPr>
           <w:p>
             <w:r>
-              <w:rPr>
-                <w:sz w:val="20"/>
-                <w:szCs w:val="20"/>
-              </w:rPr>
               <w:t>0.0043</w:t>
             </w:r>
           </w:p>
@@ -2232,10 +1808,6 @@
           </w:tcPr>
           <w:p>
             <w:r>
-              <w:rPr>
-                <w:sz w:val="20"/>
-                <w:szCs w:val="20"/>
-              </w:rPr>
               <w:t>0.0658</w:t>
             </w:r>
           </w:p>
@@ -2248,10 +1820,6 @@
           </w:tcPr>
           <w:p>
             <w:r>
-              <w:rPr>
-                <w:sz w:val="20"/>
-                <w:szCs w:val="20"/>
-              </w:rPr>
               <w:t>HGB</w:t>
             </w:r>
           </w:p>
@@ -2262,10 +1830,6 @@
           </w:tcPr>
           <w:p>
             <w:r>
-              <w:rPr>
-                <w:sz w:val="20"/>
-                <w:szCs w:val="20"/>
-              </w:rPr>
               <w:t>1.0000</w:t>
             </w:r>
           </w:p>
@@ -2276,10 +1840,6 @@
           </w:tcPr>
           <w:p>
             <w:r>
-              <w:rPr>
-                <w:sz w:val="20"/>
-                <w:szCs w:val="20"/>
-              </w:rPr>
               <w:t>1.0000</w:t>
             </w:r>
           </w:p>
@@ -2290,10 +1850,6 @@
           </w:tcPr>
           <w:p>
             <w:r>
-              <w:rPr>
-                <w:sz w:val="20"/>
-                <w:szCs w:val="20"/>
-              </w:rPr>
               <w:t>0.9102</w:t>
             </w:r>
           </w:p>
@@ -2304,10 +1860,6 @@
           </w:tcPr>
           <w:p>
             <w:r>
-              <w:rPr>
-                <w:sz w:val="20"/>
-                <w:szCs w:val="20"/>
-              </w:rPr>
               <w:t>0.0001</w:t>
             </w:r>
           </w:p>
@@ -2318,10 +1870,6 @@
           </w:tcPr>
           <w:p>
             <w:r>
-              <w:rPr>
-                <w:sz w:val="20"/>
-                <w:szCs w:val="20"/>
-              </w:rPr>
               <w:t>0.0576</w:t>
             </w:r>
           </w:p>
@@ -2334,10 +1882,6 @@
           </w:tcPr>
           <w:p>
             <w:r>
-              <w:rPr>
-                <w:sz w:val="20"/>
-                <w:szCs w:val="20"/>
-              </w:rPr>
               <w:t>MLP</w:t>
             </w:r>
           </w:p>
@@ -2348,10 +1892,6 @@
           </w:tcPr>
           <w:p>
             <w:r>
-              <w:rPr>
-                <w:sz w:val="20"/>
-                <w:szCs w:val="20"/>
-              </w:rPr>
               <w:t>0.9983</w:t>
             </w:r>
           </w:p>
@@ -2362,10 +1902,6 @@
           </w:tcPr>
           <w:p>
             <w:r>
-              <w:rPr>
-                <w:sz w:val="20"/>
-                <w:szCs w:val="20"/>
-              </w:rPr>
               <w:t>0.9971</w:t>
             </w:r>
           </w:p>
@@ -2376,10 +1912,6 @@
           </w:tcPr>
           <w:p>
             <w:r>
-              <w:rPr>
-                <w:sz w:val="20"/>
-                <w:szCs w:val="20"/>
-              </w:rPr>
               <w:t>0.9083</w:t>
             </w:r>
           </w:p>
@@ -2390,10 +1922,6 @@
           </w:tcPr>
           <w:p>
             <w:r>
-              <w:rPr>
-                <w:sz w:val="20"/>
-                <w:szCs w:val="20"/>
-              </w:rPr>
               <w:t>0.0153</w:t>
             </w:r>
           </w:p>
@@ -2404,10 +1932,6 @@
           </w:tcPr>
           <w:p>
             <w:r>
-              <w:rPr>
-                <w:sz w:val="20"/>
-                <w:szCs w:val="20"/>
-              </w:rPr>
               <w:t>0.1397</w:t>
             </w:r>
           </w:p>
@@ -2420,10 +1944,6 @@
           </w:tcPr>
           <w:p>
             <w:r>
-              <w:rPr>
-                <w:sz w:val="20"/>
-                <w:szCs w:val="20"/>
-              </w:rPr>
               <w:t>Ensemble</w:t>
             </w:r>
           </w:p>
@@ -2434,10 +1954,6 @@
           </w:tcPr>
           <w:p>
             <w:r>
-              <w:rPr>
-                <w:sz w:val="20"/>
-                <w:szCs w:val="20"/>
-              </w:rPr>
               <w:t>1.0000</w:t>
             </w:r>
           </w:p>
@@ -2448,10 +1964,6 @@
           </w:tcPr>
           <w:p>
             <w:r>
-              <w:rPr>
-                <w:sz w:val="20"/>
-                <w:szCs w:val="20"/>
-              </w:rPr>
               <w:t>1.0000</w:t>
             </w:r>
           </w:p>
@@ -2462,10 +1974,6 @@
           </w:tcPr>
           <w:p>
             <w:r>
-              <w:rPr>
-                <w:sz w:val="20"/>
-                <w:szCs w:val="20"/>
-              </w:rPr>
               <w:t>0.9050</w:t>
             </w:r>
           </w:p>
@@ -2476,10 +1984,6 @@
           </w:tcPr>
           <w:p>
             <w:r>
-              <w:rPr>
-                <w:sz w:val="20"/>
-                <w:szCs w:val="20"/>
-              </w:rPr>
               <w:t>0.0033</w:t>
             </w:r>
           </w:p>
@@ -2490,10 +1994,6 @@
           </w:tcPr>
           <w:p>
             <w:r>
-              <w:rPr>
-                <w:sz w:val="20"/>
-                <w:szCs w:val="20"/>
-              </w:rPr>
               <w:t>0.0663</w:t>
             </w:r>
           </w:p>
@@ -2546,8 +2046,6 @@
             <w:r>
               <w:rPr>
                 <w:b/>
-                <w:sz w:val="20"/>
-                <w:szCs w:val="20"/>
               </w:rPr>
               <w:t>Model</w:t>
             </w:r>
@@ -2561,8 +2059,6 @@
             <w:r>
               <w:rPr>
                 <w:b/>
-                <w:sz w:val="20"/>
-                <w:szCs w:val="20"/>
               </w:rPr>
               <w:t>Dataset</w:t>
             </w:r>
@@ -2576,8 +2072,6 @@
             <w:r>
               <w:rPr>
                 <w:b/>
-                <w:sz w:val="20"/>
-                <w:szCs w:val="20"/>
               </w:rPr>
               <w:t>Sensitivity</w:t>
             </w:r>
@@ -2591,8 +2085,6 @@
             <w:r>
               <w:rPr>
                 <w:b/>
-                <w:sz w:val="20"/>
-                <w:szCs w:val="20"/>
               </w:rPr>
               <w:t>Specificity</w:t>
             </w:r>
@@ -2606,10 +2098,6 @@
           </w:tcPr>
           <w:p>
             <w:r>
-              <w:rPr>
-                <w:sz w:val="20"/>
-                <w:szCs w:val="20"/>
-              </w:rPr>
               <w:t>LogReg</w:t>
             </w:r>
           </w:p>
@@ -2620,10 +2108,6 @@
           </w:tcPr>
           <w:p>
             <w:r>
-              <w:rPr>
-                <w:sz w:val="20"/>
-                <w:szCs w:val="20"/>
-              </w:rPr>
               <w:t>NHANES</w:t>
             </w:r>
           </w:p>
@@ -2634,10 +2118,6 @@
           </w:tcPr>
           <w:p>
             <w:r>
-              <w:rPr>
-                <w:sz w:val="20"/>
-                <w:szCs w:val="20"/>
-              </w:rPr>
               <w:t>0.963</w:t>
             </w:r>
           </w:p>
@@ -2648,10 +2128,6 @@
           </w:tcPr>
           <w:p>
             <w:r>
-              <w:rPr>
-                <w:sz w:val="20"/>
-                <w:szCs w:val="20"/>
-              </w:rPr>
               <w:t>0.742</w:t>
             </w:r>
           </w:p>
@@ -2664,10 +2140,6 @@
           </w:tcPr>
           <w:p>
             <w:r>
-              <w:rPr>
-                <w:sz w:val="20"/>
-                <w:szCs w:val="20"/>
-              </w:rPr>
               <w:t>LogReg</w:t>
             </w:r>
           </w:p>
@@ -2678,10 +2150,6 @@
           </w:tcPr>
           <w:p>
             <w:r>
-              <w:rPr>
-                <w:sz w:val="20"/>
-                <w:szCs w:val="20"/>
-              </w:rPr>
               <w:t>Tawam</w:t>
             </w:r>
           </w:p>
@@ -2692,10 +2160,6 @@
           </w:tcPr>
           <w:p>
             <w:r>
-              <w:rPr>
-                <w:sz w:val="20"/>
-                <w:szCs w:val="20"/>
-              </w:rPr>
               <w:t>0.357</w:t>
             </w:r>
           </w:p>
@@ -2706,10 +2170,6 @@
           </w:tcPr>
           <w:p>
             <w:r>
-              <w:rPr>
-                <w:sz w:val="20"/>
-                <w:szCs w:val="20"/>
-              </w:rPr>
               <w:t>1.000</w:t>
             </w:r>
           </w:p>
@@ -2722,10 +2182,6 @@
           </w:tcPr>
           <w:p>
             <w:r>
-              <w:rPr>
-                <w:sz w:val="20"/>
-                <w:szCs w:val="20"/>
-              </w:rPr>
               <w:t>RF</w:t>
             </w:r>
           </w:p>
@@ -2736,10 +2192,6 @@
           </w:tcPr>
           <w:p>
             <w:r>
-              <w:rPr>
-                <w:sz w:val="20"/>
-                <w:szCs w:val="20"/>
-              </w:rPr>
               <w:t>NHANES</w:t>
             </w:r>
           </w:p>
@@ -2750,10 +2202,6 @@
           </w:tcPr>
           <w:p>
             <w:r>
-              <w:rPr>
-                <w:sz w:val="20"/>
-                <w:szCs w:val="20"/>
-              </w:rPr>
               <w:t>1.000</w:t>
             </w:r>
           </w:p>
@@ -2764,10 +2212,6 @@
           </w:tcPr>
           <w:p>
             <w:r>
-              <w:rPr>
-                <w:sz w:val="20"/>
-                <w:szCs w:val="20"/>
-              </w:rPr>
               <w:t>1.000</w:t>
             </w:r>
           </w:p>
@@ -2780,10 +2224,6 @@
           </w:tcPr>
           <w:p>
             <w:r>
-              <w:rPr>
-                <w:sz w:val="20"/>
-                <w:szCs w:val="20"/>
-              </w:rPr>
               <w:t>RF</w:t>
             </w:r>
           </w:p>
@@ -2794,10 +2234,6 @@
           </w:tcPr>
           <w:p>
             <w:r>
-              <w:rPr>
-                <w:sz w:val="20"/>
-                <w:szCs w:val="20"/>
-              </w:rPr>
               <w:t>Tawam</w:t>
             </w:r>
           </w:p>
@@ -2808,10 +2244,6 @@
           </w:tcPr>
           <w:p>
             <w:r>
-              <w:rPr>
-                <w:sz w:val="20"/>
-                <w:szCs w:val="20"/>
-              </w:rPr>
               <w:t>0.143</w:t>
             </w:r>
           </w:p>
@@ -2822,10 +2254,6 @@
           </w:tcPr>
           <w:p>
             <w:r>
-              <w:rPr>
-                <w:sz w:val="20"/>
-                <w:szCs w:val="20"/>
-              </w:rPr>
               <w:t>1.000</w:t>
             </w:r>
           </w:p>
@@ -2838,10 +2266,6 @@
           </w:tcPr>
           <w:p>
             <w:r>
-              <w:rPr>
-                <w:sz w:val="20"/>
-                <w:szCs w:val="20"/>
-              </w:rPr>
               <w:t>HGB</w:t>
             </w:r>
           </w:p>
@@ -2852,10 +2276,6 @@
           </w:tcPr>
           <w:p>
             <w:r>
-              <w:rPr>
-                <w:sz w:val="20"/>
-                <w:szCs w:val="20"/>
-              </w:rPr>
               <w:t>NHANES</w:t>
             </w:r>
           </w:p>
@@ -2866,10 +2286,6 @@
           </w:tcPr>
           <w:p>
             <w:r>
-              <w:rPr>
-                <w:sz w:val="20"/>
-                <w:szCs w:val="20"/>
-              </w:rPr>
               <w:t>1.000</w:t>
             </w:r>
           </w:p>
@@ -2880,10 +2296,6 @@
           </w:tcPr>
           <w:p>
             <w:r>
-              <w:rPr>
-                <w:sz w:val="20"/>
-                <w:szCs w:val="20"/>
-              </w:rPr>
               <w:t>1.000</w:t>
             </w:r>
           </w:p>
@@ -2896,10 +2308,6 @@
           </w:tcPr>
           <w:p>
             <w:r>
-              <w:rPr>
-                <w:sz w:val="20"/>
-                <w:szCs w:val="20"/>
-              </w:rPr>
               <w:t>HGB</w:t>
             </w:r>
           </w:p>
@@ -2910,10 +2318,6 @@
           </w:tcPr>
           <w:p>
             <w:r>
-              <w:rPr>
-                <w:sz w:val="20"/>
-                <w:szCs w:val="20"/>
-              </w:rPr>
               <w:t>Tawam</w:t>
             </w:r>
           </w:p>
@@ -2924,10 +2328,6 @@
           </w:tcPr>
           <w:p>
             <w:r>
-              <w:rPr>
-                <w:sz w:val="20"/>
-                <w:szCs w:val="20"/>
-              </w:rPr>
               <w:t>0.429</w:t>
             </w:r>
           </w:p>
@@ -2938,10 +2338,6 @@
           </w:tcPr>
           <w:p>
             <w:r>
-              <w:rPr>
-                <w:sz w:val="20"/>
-                <w:szCs w:val="20"/>
-              </w:rPr>
               <w:t>0.982</w:t>
             </w:r>
           </w:p>
@@ -2954,10 +2350,6 @@
           </w:tcPr>
           <w:p>
             <w:r>
-              <w:rPr>
-                <w:sz w:val="20"/>
-                <w:szCs w:val="20"/>
-              </w:rPr>
               <w:t>MLP</w:t>
             </w:r>
           </w:p>
@@ -2968,10 +2360,6 @@
           </w:tcPr>
           <w:p>
             <w:r>
-              <w:rPr>
-                <w:sz w:val="20"/>
-                <w:szCs w:val="20"/>
-              </w:rPr>
               <w:t>NHANES</w:t>
             </w:r>
           </w:p>
@@ -2982,10 +2370,6 @@
           </w:tcPr>
           <w:p>
             <w:r>
-              <w:rPr>
-                <w:sz w:val="20"/>
-                <w:szCs w:val="20"/>
-              </w:rPr>
               <w:t>0.989</w:t>
             </w:r>
           </w:p>
@@ -2996,10 +2380,6 @@
           </w:tcPr>
           <w:p>
             <w:r>
-              <w:rPr>
-                <w:sz w:val="20"/>
-                <w:szCs w:val="20"/>
-              </w:rPr>
               <w:t>0.961</w:t>
             </w:r>
           </w:p>
@@ -3012,10 +2392,6 @@
           </w:tcPr>
           <w:p>
             <w:r>
-              <w:rPr>
-                <w:sz w:val="20"/>
-                <w:szCs w:val="20"/>
-              </w:rPr>
               <w:t>MLP</w:t>
             </w:r>
           </w:p>
@@ -3026,10 +2402,6 @@
           </w:tcPr>
           <w:p>
             <w:r>
-              <w:rPr>
-                <w:sz w:val="20"/>
-                <w:szCs w:val="20"/>
-              </w:rPr>
               <w:t>Tawam</w:t>
             </w:r>
           </w:p>
@@ -3040,10 +2412,6 @@
           </w:tcPr>
           <w:p>
             <w:r>
-              <w:rPr>
-                <w:sz w:val="20"/>
-                <w:szCs w:val="20"/>
-              </w:rPr>
               <w:t>0.786</w:t>
             </w:r>
           </w:p>
@@ -3054,10 +2422,6 @@
           </w:tcPr>
           <w:p>
             <w:r>
-              <w:rPr>
-                <w:sz w:val="20"/>
-                <w:szCs w:val="20"/>
-              </w:rPr>
               <w:t>0.917</w:t>
             </w:r>
           </w:p>
@@ -3070,10 +2434,6 @@
           </w:tcPr>
           <w:p>
             <w:r>
-              <w:rPr>
-                <w:sz w:val="20"/>
-                <w:szCs w:val="20"/>
-              </w:rPr>
               <w:t>Ensemble</w:t>
             </w:r>
           </w:p>
@@ -3084,10 +2444,6 @@
           </w:tcPr>
           <w:p>
             <w:r>
-              <w:rPr>
-                <w:sz w:val="20"/>
-                <w:szCs w:val="20"/>
-              </w:rPr>
               <w:t>NHANES</w:t>
             </w:r>
           </w:p>
@@ -3098,10 +2454,6 @@
           </w:tcPr>
           <w:p>
             <w:r>
-              <w:rPr>
-                <w:sz w:val="20"/>
-                <w:szCs w:val="20"/>
-              </w:rPr>
               <w:t>1.000</w:t>
             </w:r>
           </w:p>
@@ -3112,10 +2464,6 @@
           </w:tcPr>
           <w:p>
             <w:r>
-              <w:rPr>
-                <w:sz w:val="20"/>
-                <w:szCs w:val="20"/>
-              </w:rPr>
               <w:t>1.000</w:t>
             </w:r>
           </w:p>
@@ -3128,10 +2476,6 @@
           </w:tcPr>
           <w:p>
             <w:r>
-              <w:rPr>
-                <w:sz w:val="20"/>
-                <w:szCs w:val="20"/>
-              </w:rPr>
               <w:t>Ensemble</w:t>
             </w:r>
           </w:p>
@@ -3142,10 +2486,6 @@
           </w:tcPr>
           <w:p>
             <w:r>
-              <w:rPr>
-                <w:sz w:val="20"/>
-                <w:szCs w:val="20"/>
-              </w:rPr>
               <w:t>Tawam</w:t>
             </w:r>
           </w:p>
@@ -3156,10 +2496,6 @@
           </w:tcPr>
           <w:p>
             <w:r>
-              <w:rPr>
-                <w:sz w:val="20"/>
-                <w:szCs w:val="20"/>
-              </w:rPr>
               <w:t>0.286</w:t>
             </w:r>
           </w:p>
@@ -3170,10 +2506,6 @@
           </w:tcPr>
           <w:p>
             <w:r>
-              <w:rPr>
-                <w:sz w:val="20"/>
-                <w:szCs w:val="20"/>
-              </w:rPr>
               <w:t>1.000</w:t>
             </w:r>
           </w:p>
@@ -3282,8 +2614,6 @@
             <w:r>
               <w:rPr>
                 <w:b/>
-                <w:sz w:val="20"/>
-                <w:szCs w:val="20"/>
               </w:rPr>
               <w:t>Model</w:t>
             </w:r>
@@ -3297,8 +2627,6 @@
             <w:r>
               <w:rPr>
                 <w:b/>
-                <w:sz w:val="20"/>
-                <w:szCs w:val="20"/>
               </w:rPr>
               <w:t>All features</w:t>
             </w:r>
@@ -3312,8 +2640,6 @@
             <w:r>
               <w:rPr>
                 <w:b/>
-                <w:sz w:val="20"/>
-                <w:szCs w:val="20"/>
               </w:rPr>
               <w:t>No eGFR/ACR</w:t>
             </w:r>
@@ -3327,8 +2653,6 @@
             <w:r>
               <w:rPr>
                 <w:b/>
-                <w:sz w:val="20"/>
-                <w:szCs w:val="20"/>
               </w:rPr>
               <w:t>No eGFR/ACR/Cr/BUN</w:t>
             </w:r>
@@ -3342,10 +2666,6 @@
           </w:tcPr>
           <w:p>
             <w:r>
-              <w:rPr>
-                <w:sz w:val="20"/>
-                <w:szCs w:val="20"/>
-              </w:rPr>
               <w:t>LogReg</w:t>
             </w:r>
           </w:p>
@@ -3356,10 +2676,6 @@
           </w:tcPr>
           <w:p>
             <w:r>
-              <w:rPr>
-                <w:sz w:val="20"/>
-                <w:szCs w:val="20"/>
-              </w:rPr>
               <w:t>0.9457</w:t>
             </w:r>
           </w:p>
@@ -3370,10 +2686,6 @@
           </w:tcPr>
           <w:p>
             <w:r>
-              <w:rPr>
-                <w:sz w:val="20"/>
-                <w:szCs w:val="20"/>
-              </w:rPr>
               <w:t>0.8131</w:t>
             </w:r>
           </w:p>
@@ -3384,10 +2696,6 @@
           </w:tcPr>
           <w:p>
             <w:r>
-              <w:rPr>
-                <w:sz w:val="20"/>
-                <w:szCs w:val="20"/>
-              </w:rPr>
               <w:t>0.6926</w:t>
             </w:r>
           </w:p>
@@ -3400,10 +2708,6 @@
           </w:tcPr>
           <w:p>
             <w:r>
-              <w:rPr>
-                <w:sz w:val="20"/>
-                <w:szCs w:val="20"/>
-              </w:rPr>
               <w:t>RF</w:t>
             </w:r>
           </w:p>
@@ -3414,10 +2718,6 @@
           </w:tcPr>
           <w:p>
             <w:r>
-              <w:rPr>
-                <w:sz w:val="20"/>
-                <w:szCs w:val="20"/>
-              </w:rPr>
               <w:t>1.0000</w:t>
             </w:r>
           </w:p>
@@ -3428,10 +2728,6 @@
           </w:tcPr>
           <w:p>
             <w:r>
-              <w:rPr>
-                <w:sz w:val="20"/>
-                <w:szCs w:val="20"/>
-              </w:rPr>
               <w:t>0.9737</w:t>
             </w:r>
           </w:p>
@@ -3442,10 +2738,6 @@
           </w:tcPr>
           <w:p>
             <w:r>
-              <w:rPr>
-                <w:sz w:val="20"/>
-                <w:szCs w:val="20"/>
-              </w:rPr>
               <w:t>0.9218</w:t>
             </w:r>
           </w:p>
@@ -3458,10 +2750,6 @@
           </w:tcPr>
           <w:p>
             <w:r>
-              <w:rPr>
-                <w:sz w:val="20"/>
-                <w:szCs w:val="20"/>
-              </w:rPr>
               <w:t>HGB</w:t>
             </w:r>
           </w:p>
@@ -3472,10 +2760,6 @@
           </w:tcPr>
           <w:p>
             <w:r>
-              <w:rPr>
-                <w:sz w:val="20"/>
-                <w:szCs w:val="20"/>
-              </w:rPr>
               <w:t>1.0000</w:t>
             </w:r>
           </w:p>
@@ -3486,10 +2770,6 @@
           </w:tcPr>
           <w:p>
             <w:r>
-              <w:rPr>
-                <w:sz w:val="20"/>
-                <w:szCs w:val="20"/>
-              </w:rPr>
               <w:t>0.9751</w:t>
             </w:r>
           </w:p>
@@ -3500,10 +2780,6 @@
           </w:tcPr>
           <w:p>
             <w:r>
-              <w:rPr>
-                <w:sz w:val="20"/>
-                <w:szCs w:val="20"/>
-              </w:rPr>
               <w:t>0.9205</w:t>
             </w:r>
           </w:p>
@@ -3516,10 +2792,6 @@
           </w:tcPr>
           <w:p>
             <w:r>
-              <w:rPr>
-                <w:sz w:val="20"/>
-                <w:szCs w:val="20"/>
-              </w:rPr>
               <w:t>MLP</w:t>
             </w:r>
           </w:p>
@@ -3530,10 +2802,6 @@
           </w:tcPr>
           <w:p>
             <w:r>
-              <w:rPr>
-                <w:sz w:val="20"/>
-                <w:szCs w:val="20"/>
-              </w:rPr>
               <w:t>0.9971</w:t>
             </w:r>
           </w:p>
@@ -3544,10 +2812,6 @@
           </w:tcPr>
           <w:p>
             <w:r>
-              <w:rPr>
-                <w:sz w:val="20"/>
-                <w:szCs w:val="20"/>
-              </w:rPr>
               <w:t>0.9690</w:t>
             </w:r>
           </w:p>
@@ -3558,10 +2822,6 @@
           </w:tcPr>
           <w:p>
             <w:r>
-              <w:rPr>
-                <w:sz w:val="20"/>
-                <w:szCs w:val="20"/>
-              </w:rPr>
               <w:t>0.9155</w:t>
             </w:r>
           </w:p>
@@ -3574,10 +2834,6 @@
           </w:tcPr>
           <w:p>
             <w:r>
-              <w:rPr>
-                <w:sz w:val="20"/>
-                <w:szCs w:val="20"/>
-              </w:rPr>
               <w:t>Ensemble</w:t>
             </w:r>
           </w:p>
@@ -3588,10 +2844,6 @@
           </w:tcPr>
           <w:p>
             <w:r>
-              <w:rPr>
-                <w:sz w:val="20"/>
-                <w:szCs w:val="20"/>
-              </w:rPr>
               <w:t>1.0000</w:t>
             </w:r>
           </w:p>
@@ -3602,10 +2854,6 @@
           </w:tcPr>
           <w:p>
             <w:r>
-              <w:rPr>
-                <w:sz w:val="20"/>
-                <w:szCs w:val="20"/>
-              </w:rPr>
               <w:t>0.9749</w:t>
             </w:r>
           </w:p>
@@ -3616,10 +2864,6 @@
           </w:tcPr>
           <w:p>
             <w:r>
-              <w:rPr>
-                <w:sz w:val="20"/>
-                <w:szCs w:val="20"/>
-              </w:rPr>
               <w:t>0.9216</w:t>
             </w:r>
           </w:p>
@@ -3845,8 +3089,6 @@
             <w:r>
               <w:rPr>
                 <w:b/>
-                <w:sz w:val="20"/>
-                <w:szCs w:val="20"/>
               </w:rPr>
               <w:t>Model</w:t>
             </w:r>
@@ -3860,8 +3102,6 @@
             <w:r>
               <w:rPr>
                 <w:b/>
-                <w:sz w:val="20"/>
-                <w:szCs w:val="20"/>
               </w:rPr>
               <w:t>c ceiling</w:t>
             </w:r>
@@ -3875,8 +3115,6 @@
             <w:r>
               <w:rPr>
                 <w:b/>
-                <w:sz w:val="20"/>
-                <w:szCs w:val="20"/>
               </w:rPr>
               <w:t>a</w:t>
             </w:r>
@@ -3890,8 +3128,6 @@
             <w:r>
               <w:rPr>
                 <w:b/>
-                <w:sz w:val="20"/>
-                <w:szCs w:val="20"/>
               </w:rPr>
               <w:t>b</w:t>
             </w:r>
@@ -3905,8 +3141,6 @@
             <w:r>
               <w:rPr>
                 <w:b/>
-                <w:sz w:val="20"/>
-                <w:szCs w:val="20"/>
               </w:rPr>
               <w:t>R^2</w:t>
             </w:r>
@@ -3920,8 +3154,6 @@
             <w:r>
               <w:rPr>
                 <w:b/>
-                <w:sz w:val="20"/>
-                <w:szCs w:val="20"/>
               </w:rPr>
               <w:t>Drop–2 c</w:t>
             </w:r>
@@ -3935,10 +3167,6 @@
           </w:tcPr>
           <w:p>
             <w:r>
-              <w:rPr>
-                <w:sz w:val="20"/>
-                <w:szCs w:val="20"/>
-              </w:rPr>
               <w:t>LogReg</w:t>
             </w:r>
           </w:p>
@@ -3949,10 +3177,6 @@
           </w:tcPr>
           <w:p>
             <w:r>
-              <w:rPr>
-                <w:sz w:val="20"/>
-                <w:szCs w:val="20"/>
-              </w:rPr>
               <w:t>0.946 (0.946–0.953)</w:t>
             </w:r>
           </w:p>
@@ -3963,10 +3187,6 @@
           </w:tcPr>
           <w:p>
             <w:r>
-              <w:rPr>
-                <w:sz w:val="20"/>
-                <w:szCs w:val="20"/>
-              </w:rPr>
               <w:t>1.736 (0.349–3.156)</w:t>
             </w:r>
           </w:p>
@@ -3977,10 +3197,6 @@
           </w:tcPr>
           <w:p>
             <w:r>
-              <w:rPr>
-                <w:sz w:val="20"/>
-                <w:szCs w:val="20"/>
-              </w:rPr>
               <w:t>0.780 (0.427–0.929)</w:t>
             </w:r>
           </w:p>
@@ -3991,10 +3207,6 @@
           </w:tcPr>
           <w:p>
             <w:r>
-              <w:rPr>
-                <w:sz w:val="20"/>
-                <w:szCs w:val="20"/>
-              </w:rPr>
               <w:t>0.990</w:t>
             </w:r>
           </w:p>
@@ -4005,10 +3217,6 @@
           </w:tcPr>
           <w:p>
             <w:r>
-              <w:rPr>
-                <w:sz w:val="20"/>
-                <w:szCs w:val="20"/>
-              </w:rPr>
               <w:t>0.950</w:t>
             </w:r>
           </w:p>
@@ -4021,10 +3229,6 @@
           </w:tcPr>
           <w:p>
             <w:r>
-              <w:rPr>
-                <w:sz w:val="20"/>
-                <w:szCs w:val="20"/>
-              </w:rPr>
               <w:t>RF</w:t>
             </w:r>
           </w:p>
@@ -4035,10 +3239,6 @@
           </w:tcPr>
           <w:p>
             <w:r>
-              <w:rPr>
-                <w:sz w:val="20"/>
-                <w:szCs w:val="20"/>
-              </w:rPr>
               <w:t>1.000 (1.000–1.000)</w:t>
             </w:r>
           </w:p>
@@ -4049,10 +3249,6 @@
           </w:tcPr>
           <w:p>
             <w:r>
-              <w:rPr>
-                <w:sz w:val="20"/>
-                <w:szCs w:val="20"/>
-              </w:rPr>
               <w:t>1.446 (0.889–199.994)</w:t>
             </w:r>
           </w:p>
@@ -4063,10 +3259,6 @@
           </w:tcPr>
           <w:p>
             <w:r>
-              <w:rPr>
-                <w:sz w:val="20"/>
-                <w:szCs w:val="20"/>
-              </w:rPr>
               <w:t>0.864 (0.746–1.774)</w:t>
             </w:r>
           </w:p>
@@ -4077,10 +3269,6 @@
           </w:tcPr>
           <w:p>
             <w:r>
-              <w:rPr>
-                <w:sz w:val="20"/>
-                <w:szCs w:val="20"/>
-              </w:rPr>
               <w:t>0.980</w:t>
             </w:r>
           </w:p>
@@ -4091,10 +3279,6 @@
           </w:tcPr>
           <w:p>
             <w:r>
-              <w:rPr>
-                <w:sz w:val="20"/>
-                <w:szCs w:val="20"/>
-              </w:rPr>
               <w:t>1.000</w:t>
             </w:r>
           </w:p>
@@ -4107,10 +3291,6 @@
           </w:tcPr>
           <w:p>
             <w:r>
-              <w:rPr>
-                <w:sz w:val="20"/>
-                <w:szCs w:val="20"/>
-              </w:rPr>
               <w:t>HGB</w:t>
             </w:r>
           </w:p>
@@ -4121,10 +3301,6 @@
           </w:tcPr>
           <w:p>
             <w:r>
-              <w:rPr>
-                <w:sz w:val="20"/>
-                <w:szCs w:val="20"/>
-              </w:rPr>
               <w:t>1.000 (1.000–1.000)</w:t>
             </w:r>
           </w:p>
@@ -4135,10 +3311,6 @@
           </w:tcPr>
           <w:p>
             <w:r>
-              <w:rPr>
-                <w:sz w:val="20"/>
-                <w:szCs w:val="20"/>
-              </w:rPr>
               <w:t>200.000 (14.296–200.000)</w:t>
             </w:r>
           </w:p>
@@ -4149,10 +3321,6 @@
           </w:tcPr>
           <w:p>
             <w:r>
-              <w:rPr>
-                <w:sz w:val="20"/>
-                <w:szCs w:val="20"/>
-              </w:rPr>
               <w:t>1.637 (1.560–1.965)</w:t>
             </w:r>
           </w:p>
@@ -4163,10 +3331,6 @@
           </w:tcPr>
           <w:p>
             <w:r>
-              <w:rPr>
-                <w:sz w:val="20"/>
-                <w:szCs w:val="20"/>
-              </w:rPr>
               <w:t>0.923</w:t>
             </w:r>
           </w:p>
@@ -4177,10 +3341,6 @@
           </w:tcPr>
           <w:p>
             <w:r>
-              <w:rPr>
-                <w:sz w:val="20"/>
-                <w:szCs w:val="20"/>
-              </w:rPr>
               <w:t>1.000</w:t>
             </w:r>
           </w:p>
@@ -4193,10 +3353,6 @@
           </w:tcPr>
           <w:p>
             <w:r>
-              <w:rPr>
-                <w:sz w:val="20"/>
-                <w:szCs w:val="20"/>
-              </w:rPr>
               <w:t>MLP</w:t>
             </w:r>
           </w:p>
@@ -4207,10 +3363,6 @@
           </w:tcPr>
           <w:p>
             <w:r>
-              <w:rPr>
-                <w:sz w:val="20"/>
-                <w:szCs w:val="20"/>
-              </w:rPr>
               <w:t>1.000 (1.000–1.000)</w:t>
             </w:r>
           </w:p>
@@ -4221,10 +3373,6 @@
           </w:tcPr>
           <w:p>
             <w:r>
-              <w:rPr>
-                <w:sz w:val="20"/>
-                <w:szCs w:val="20"/>
-              </w:rPr>
               <w:t>4.790 (2.996–49.663)</w:t>
             </w:r>
           </w:p>
@@ -4235,10 +3383,6 @@
           </w:tcPr>
           <w:p>
             <w:r>
-              <w:rPr>
-                <w:sz w:val="20"/>
-                <w:szCs w:val="20"/>
-              </w:rPr>
               <w:t>0.629 (0.513–1.053)</w:t>
             </w:r>
           </w:p>
@@ -4249,10 +3393,6 @@
           </w:tcPr>
           <w:p>
             <w:r>
-              <w:rPr>
-                <w:sz w:val="20"/>
-                <w:szCs w:val="20"/>
-              </w:rPr>
               <w:t>0.948</w:t>
             </w:r>
           </w:p>
@@ -4263,10 +3403,6 @@
           </w:tcPr>
           <w:p>
             <w:r>
-              <w:rPr>
-                <w:sz w:val="20"/>
-                <w:szCs w:val="20"/>
-              </w:rPr>
               <w:t>1.000</w:t>
             </w:r>
           </w:p>
@@ -4279,10 +3415,6 @@
           </w:tcPr>
           <w:p>
             <w:r>
-              <w:rPr>
-                <w:sz w:val="20"/>
-                <w:szCs w:val="20"/>
-              </w:rPr>
               <w:t>Ensemble</w:t>
             </w:r>
           </w:p>
@@ -4293,10 +3425,6 @@
           </w:tcPr>
           <w:p>
             <w:r>
-              <w:rPr>
-                <w:sz w:val="20"/>
-                <w:szCs w:val="20"/>
-              </w:rPr>
               <w:t>1.000 (1.000–1.000)</w:t>
             </w:r>
           </w:p>
@@ -4307,10 +3435,6 @@
           </w:tcPr>
           <w:p>
             <w:r>
-              <w:rPr>
-                <w:sz w:val="20"/>
-                <w:szCs w:val="20"/>
-              </w:rPr>
               <w:t>49.917 (45.269–199.971)</w:t>
             </w:r>
           </w:p>
@@ -4321,10 +3445,6 @@
           </w:tcPr>
           <w:p>
             <w:r>
-              <w:rPr>
-                <w:sz w:val="20"/>
-                <w:szCs w:val="20"/>
-              </w:rPr>
               <w:t>1.668 (1.646–1.969)</w:t>
             </w:r>
           </w:p>
@@ -4335,10 +3455,6 @@
           </w:tcPr>
           <w:p>
             <w:r>
-              <w:rPr>
-                <w:sz w:val="20"/>
-                <w:szCs w:val="20"/>
-              </w:rPr>
               <w:t>1.000</w:t>
             </w:r>
           </w:p>
@@ -4349,10 +3465,6 @@
           </w:tcPr>
           <w:p>
             <w:r>
-              <w:rPr>
-                <w:sz w:val="20"/>
-                <w:szCs w:val="20"/>
-              </w:rPr>
               <w:t>1.000</w:t>
             </w:r>
           </w:p>
@@ -4365,10 +3477,6 @@
           </w:tcPr>
           <w:p>
             <w:r>
-              <w:rPr>
-                <w:sz w:val="20"/>
-                <w:szCs w:val="20"/>
-              </w:rPr>
               <w:t>LogReg</w:t>
             </w:r>
           </w:p>
@@ -4379,10 +3487,6 @@
           </w:tcPr>
           <w:p>
             <w:r>
-              <w:rPr>
-                <w:sz w:val="20"/>
-                <w:szCs w:val="20"/>
-              </w:rPr>
               <w:t>0.813 (0.813–0.814)</w:t>
             </w:r>
           </w:p>
@@ -4393,10 +3497,6 @@
           </w:tcPr>
           <w:p>
             <w:r>
-              <w:rPr>
-                <w:sz w:val="20"/>
-                <w:szCs w:val="20"/>
-              </w:rPr>
               <w:t>12.850 (1.612–22.715)</w:t>
             </w:r>
           </w:p>
@@ -4407,10 +3507,6 @@
           </w:tcPr>
           <w:p>
             <w:r>
-              <w:rPr>
-                <w:sz w:val="20"/>
-                <w:szCs w:val="20"/>
-              </w:rPr>
               <w:t>1.305 (0.869–1.449)</w:t>
             </w:r>
           </w:p>
@@ -4421,10 +3517,6 @@
           </w:tcPr>
           <w:p>
             <w:r>
-              <w:rPr>
-                <w:sz w:val="20"/>
-                <w:szCs w:val="20"/>
-              </w:rPr>
               <w:t>0.996</w:t>
             </w:r>
           </w:p>
@@ -4435,10 +3527,6 @@
           </w:tcPr>
           <w:p>
             <w:r>
-              <w:rPr>
-                <w:sz w:val="20"/>
-                <w:szCs w:val="20"/>
-              </w:rPr>
               <w:t>0.813</w:t>
             </w:r>
           </w:p>
@@ -4451,10 +3539,6 @@
           </w:tcPr>
           <w:p>
             <w:r>
-              <w:rPr>
-                <w:sz w:val="20"/>
-                <w:szCs w:val="20"/>
-              </w:rPr>
               <w:t>RF</w:t>
             </w:r>
           </w:p>
@@ -4465,10 +3549,6 @@
           </w:tcPr>
           <w:p>
             <w:r>
-              <w:rPr>
-                <w:sz w:val="20"/>
-                <w:szCs w:val="20"/>
-              </w:rPr>
               <w:t>0.974 (0.974–0.978)</w:t>
             </w:r>
           </w:p>
@@ -4479,10 +3559,6 @@
           </w:tcPr>
           <w:p>
             <w:r>
-              <w:rPr>
-                <w:sz w:val="20"/>
-                <w:szCs w:val="20"/>
-              </w:rPr>
               <w:t>1.195 (0.402–1.461)</w:t>
             </w:r>
           </w:p>
@@ -4493,10 +3569,6 @@
           </w:tcPr>
           <w:p>
             <w:r>
-              <w:rPr>
-                <w:sz w:val="20"/>
-                <w:szCs w:val="20"/>
-              </w:rPr>
               <w:t>0.731 (0.502–0.782)</w:t>
             </w:r>
           </w:p>
@@ -4507,10 +3579,6 @@
           </w:tcPr>
           <w:p>
             <w:r>
-              <w:rPr>
-                <w:sz w:val="20"/>
-                <w:szCs w:val="20"/>
-              </w:rPr>
               <w:t>0.998</w:t>
             </w:r>
           </w:p>
@@ -4521,10 +3589,6 @@
           </w:tcPr>
           <w:p>
             <w:r>
-              <w:rPr>
-                <w:sz w:val="20"/>
-                <w:szCs w:val="20"/>
-              </w:rPr>
               <w:t>0.977</w:t>
             </w:r>
           </w:p>
@@ -4537,10 +3601,6 @@
           </w:tcPr>
           <w:p>
             <w:r>
-              <w:rPr>
-                <w:sz w:val="20"/>
-                <w:szCs w:val="20"/>
-              </w:rPr>
               <w:t>HGB</w:t>
             </w:r>
           </w:p>
@@ -4551,10 +3611,6 @@
           </w:tcPr>
           <w:p>
             <w:r>
-              <w:rPr>
-                <w:sz w:val="20"/>
-                <w:szCs w:val="20"/>
-              </w:rPr>
               <w:t>0.975 (0.975–0.989)</w:t>
             </w:r>
           </w:p>
@@ -4565,10 +3621,6 @@
           </w:tcPr>
           <w:p>
             <w:r>
-              <w:rPr>
-                <w:sz w:val="20"/>
-                <w:szCs w:val="20"/>
-              </w:rPr>
               <w:t>200.000 (0.383–200.000)</w:t>
             </w:r>
           </w:p>
@@ -4579,10 +3631,6 @@
           </w:tcPr>
           <w:p>
             <w:r>
-              <w:rPr>
-                <w:sz w:val="20"/>
-                <w:szCs w:val="20"/>
-              </w:rPr>
               <w:t>1.636 (0.428–1.642)</w:t>
             </w:r>
           </w:p>
@@ -4593,10 +3641,6 @@
           </w:tcPr>
           <w:p>
             <w:r>
-              <w:rPr>
-                <w:sz w:val="20"/>
-                <w:szCs w:val="20"/>
-              </w:rPr>
               <w:t>0.972</w:t>
             </w:r>
           </w:p>
@@ -4607,10 +3651,6 @@
           </w:tcPr>
           <w:p>
             <w:r>
-              <w:rPr>
-                <w:sz w:val="20"/>
-                <w:szCs w:val="20"/>
-              </w:rPr>
               <w:t>0.981</w:t>
             </w:r>
           </w:p>
@@ -4623,10 +3663,6 @@
           </w:tcPr>
           <w:p>
             <w:r>
-              <w:rPr>
-                <w:sz w:val="20"/>
-                <w:szCs w:val="20"/>
-              </w:rPr>
               <w:t>MLP</w:t>
             </w:r>
           </w:p>
@@ -4637,10 +3673,6 @@
           </w:tcPr>
           <w:p>
             <w:r>
-              <w:rPr>
-                <w:sz w:val="20"/>
-                <w:szCs w:val="20"/>
-              </w:rPr>
               <w:t>1.000 (0.972–1.000)</w:t>
             </w:r>
           </w:p>
@@ -4651,10 +3683,6 @@
           </w:tcPr>
           <w:p>
             <w:r>
-              <w:rPr>
-                <w:sz w:val="20"/>
-                <w:szCs w:val="20"/>
-              </w:rPr>
               <w:t>2.658 (1.571–200.000)</w:t>
             </w:r>
           </w:p>
@@ -4665,10 +3693,6 @@
           </w:tcPr>
           <w:p>
             <w:r>
-              <w:rPr>
-                <w:sz w:val="20"/>
-                <w:szCs w:val="20"/>
-              </w:rPr>
               <w:t>0.448 (0.318–1.211)</w:t>
             </w:r>
           </w:p>
@@ -4679,10 +3703,6 @@
           </w:tcPr>
           <w:p>
             <w:r>
-              <w:rPr>
-                <w:sz w:val="20"/>
-                <w:szCs w:val="20"/>
-              </w:rPr>
               <w:t>0.859</w:t>
             </w:r>
           </w:p>
@@ -4693,10 +3713,6 @@
           </w:tcPr>
           <w:p>
             <w:r>
-              <w:rPr>
-                <w:sz w:val="20"/>
-                <w:szCs w:val="20"/>
-              </w:rPr>
               <w:t>0.973</w:t>
             </w:r>
           </w:p>
@@ -4709,10 +3725,6 @@
           </w:tcPr>
           <w:p>
             <w:r>
-              <w:rPr>
-                <w:sz w:val="20"/>
-                <w:szCs w:val="20"/>
-              </w:rPr>
               <w:t>Ensemble</w:t>
             </w:r>
           </w:p>
@@ -4723,10 +3735,6 @@
           </w:tcPr>
           <w:p>
             <w:r>
-              <w:rPr>
-                <w:sz w:val="20"/>
-                <w:szCs w:val="20"/>
-              </w:rPr>
               <w:t>0.975 (0.975–0.986)</w:t>
             </w:r>
           </w:p>
@@ -4737,10 +3745,6 @@
           </w:tcPr>
           <w:p>
             <w:r>
-              <w:rPr>
-                <w:sz w:val="20"/>
-                <w:szCs w:val="20"/>
-              </w:rPr>
               <w:t>3.498 (0.172–9.804)</w:t>
             </w:r>
           </w:p>
@@ -4751,10 +3755,6 @@
           </w:tcPr>
           <w:p>
             <w:r>
-              <w:rPr>
-                <w:sz w:val="20"/>
-                <w:szCs w:val="20"/>
-              </w:rPr>
               <w:t>0.946 (0.303–1.203)</w:t>
             </w:r>
           </w:p>
@@ -4765,10 +3765,6 @@
           </w:tcPr>
           <w:p>
             <w:r>
-              <w:rPr>
-                <w:sz w:val="20"/>
-                <w:szCs w:val="20"/>
-              </w:rPr>
               <w:t>0.978</w:t>
             </w:r>
           </w:p>
@@ -4779,10 +3775,6 @@
           </w:tcPr>
           <w:p>
             <w:r>
-              <w:rPr>
-                <w:sz w:val="20"/>
-                <w:szCs w:val="20"/>
-              </w:rPr>
               <w:t>0.985</w:t>
             </w:r>
           </w:p>
@@ -4795,10 +3787,6 @@
           </w:tcPr>
           <w:p>
             <w:r>
-              <w:rPr>
-                <w:sz w:val="20"/>
-                <w:szCs w:val="20"/>
-              </w:rPr>
               <w:t>LogReg</w:t>
             </w:r>
           </w:p>
@@ -4809,10 +3797,6 @@
           </w:tcPr>
           <w:p>
             <w:r>
-              <w:rPr>
-                <w:sz w:val="20"/>
-                <w:szCs w:val="20"/>
-              </w:rPr>
               <w:t>0.693 (0.693–0.696)</w:t>
             </w:r>
           </w:p>
@@ -4823,10 +3807,6 @@
           </w:tcPr>
           <w:p>
             <w:r>
-              <w:rPr>
-                <w:sz w:val="20"/>
-                <w:szCs w:val="20"/>
-              </w:rPr>
               <w:t>4.643 (0.772–9.046)</w:t>
             </w:r>
           </w:p>
@@ -4837,10 +3817,6 @@
           </w:tcPr>
           <w:p>
             <w:r>
-              <w:rPr>
-                <w:sz w:val="20"/>
-                <w:szCs w:val="20"/>
-              </w:rPr>
               <w:t>1.038 (0.655–1.204)</w:t>
             </w:r>
           </w:p>
@@ -4851,10 +3827,6 @@
           </w:tcPr>
           <w:p>
             <w:r>
-              <w:rPr>
-                <w:sz w:val="20"/>
-                <w:szCs w:val="20"/>
-              </w:rPr>
               <w:t>0.995</w:t>
             </w:r>
           </w:p>
@@ -4865,10 +3837,6 @@
           </w:tcPr>
           <w:p>
             <w:r>
-              <w:rPr>
-                <w:sz w:val="20"/>
-                <w:szCs w:val="20"/>
-              </w:rPr>
               <w:t>0.694</w:t>
             </w:r>
           </w:p>
@@ -4881,10 +3849,6 @@
           </w:tcPr>
           <w:p>
             <w:r>
-              <w:rPr>
-                <w:sz w:val="20"/>
-                <w:szCs w:val="20"/>
-              </w:rPr>
               <w:t>RF</w:t>
             </w:r>
           </w:p>
@@ -4895,10 +3859,6 @@
           </w:tcPr>
           <w:p>
             <w:r>
-              <w:rPr>
-                <w:sz w:val="20"/>
-                <w:szCs w:val="20"/>
-              </w:rPr>
               <w:t>0.922 (0.921–0.925)</w:t>
             </w:r>
           </w:p>
@@ -4909,10 +3869,6 @@
           </w:tcPr>
           <w:p>
             <w:r>
-              <w:rPr>
-                <w:sz w:val="20"/>
-                <w:szCs w:val="20"/>
-              </w:rPr>
               <w:t>2.417 (0.910–2.573)</w:t>
             </w:r>
           </w:p>
@@ -4923,10 +3879,6 @@
           </w:tcPr>
           <w:p>
             <w:r>
-              <w:rPr>
-                <w:sz w:val="20"/>
-                <w:szCs w:val="20"/>
-              </w:rPr>
               <w:t>0.786 (0.589–0.803)</w:t>
             </w:r>
           </w:p>
@@ -4937,10 +3889,6 @@
           </w:tcPr>
           <w:p>
             <w:r>
-              <w:rPr>
-                <w:sz w:val="20"/>
-                <w:szCs w:val="20"/>
-              </w:rPr>
               <w:t>0.999</w:t>
             </w:r>
           </w:p>
@@ -4951,10 +3899,6 @@
           </w:tcPr>
           <w:p>
             <w:r>
-              <w:rPr>
-                <w:sz w:val="20"/>
-                <w:szCs w:val="20"/>
-              </w:rPr>
               <w:t>0.925</w:t>
             </w:r>
           </w:p>
@@ -4967,10 +3911,6 @@
           </w:tcPr>
           <w:p>
             <w:r>
-              <w:rPr>
-                <w:sz w:val="20"/>
-                <w:szCs w:val="20"/>
-              </w:rPr>
               <w:t>HGB</w:t>
             </w:r>
           </w:p>
@@ -4981,10 +3921,6 @@
           </w:tcPr>
           <w:p>
             <w:r>
-              <w:rPr>
-                <w:sz w:val="20"/>
-                <w:szCs w:val="20"/>
-              </w:rPr>
               <w:t>0.919 (0.919–0.953)</w:t>
             </w:r>
           </w:p>
@@ -4995,10 +3931,6 @@
           </w:tcPr>
           <w:p>
             <w:r>
-              <w:rPr>
-                <w:sz w:val="20"/>
-                <w:szCs w:val="20"/>
-              </w:rPr>
               <w:t>200.000 (0.228–200.000)</w:t>
             </w:r>
           </w:p>
@@ -5009,10 +3941,6 @@
           </w:tcPr>
           <w:p>
             <w:r>
-              <w:rPr>
-                <w:sz w:val="20"/>
-                <w:szCs w:val="20"/>
-              </w:rPr>
               <w:t>1.672 (0.201–1.680)</w:t>
             </w:r>
           </w:p>
@@ -5023,10 +3951,6 @@
           </w:tcPr>
           <w:p>
             <w:r>
-              <w:rPr>
-                <w:sz w:val="20"/>
-                <w:szCs w:val="20"/>
-              </w:rPr>
               <w:t>0.973</w:t>
             </w:r>
           </w:p>
@@ -5037,10 +3961,6 @@
           </w:tcPr>
           <w:p>
             <w:r>
-              <w:rPr>
-                <w:sz w:val="20"/>
-                <w:szCs w:val="20"/>
-              </w:rPr>
               <w:t>0.947</w:t>
             </w:r>
           </w:p>
@@ -5053,10 +3973,6 @@
           </w:tcPr>
           <w:p>
             <w:r>
-              <w:rPr>
-                <w:sz w:val="20"/>
-                <w:szCs w:val="20"/>
-              </w:rPr>
               <w:t>MLP</w:t>
             </w:r>
           </w:p>
@@ -5067,10 +3983,6 @@
           </w:tcPr>
           <w:p>
             <w:r>
-              <w:rPr>
-                <w:sz w:val="20"/>
-                <w:szCs w:val="20"/>
-              </w:rPr>
               <w:t>1.000 (0.918–1.000)</w:t>
             </w:r>
           </w:p>
@@ -5081,10 +3993,6 @@
           </w:tcPr>
           <w:p>
             <w:r>
-              <w:rPr>
-                <w:sz w:val="20"/>
-                <w:szCs w:val="20"/>
-              </w:rPr>
               <w:t>1.782 (1.284–129.410)</w:t>
             </w:r>
           </w:p>
@@ -5095,10 +4003,6 @@
           </w:tcPr>
           <w:p>
             <w:r>
-              <w:rPr>
-                <w:sz w:val="20"/>
-                <w:szCs w:val="20"/>
-              </w:rPr>
               <w:t>0.325 (0.246–1.113)</w:t>
             </w:r>
           </w:p>
@@ -5109,10 +4013,6 @@
           </w:tcPr>
           <w:p>
             <w:r>
-              <w:rPr>
-                <w:sz w:val="20"/>
-                <w:szCs w:val="20"/>
-              </w:rPr>
               <w:t>0.869</w:t>
             </w:r>
           </w:p>
@@ -5123,10 +4023,6 @@
           </w:tcPr>
           <w:p>
             <w:r>
-              <w:rPr>
-                <w:sz w:val="20"/>
-                <w:szCs w:val="20"/>
-              </w:rPr>
               <w:t>0.921</w:t>
             </w:r>
           </w:p>
@@ -5139,10 +4035,6 @@
           </w:tcPr>
           <w:p>
             <w:r>
-              <w:rPr>
-                <w:sz w:val="20"/>
-                <w:szCs w:val="20"/>
-              </w:rPr>
               <w:t>Ensemble</w:t>
             </w:r>
           </w:p>
@@ -5153,10 +4045,6 @@
           </w:tcPr>
           <w:p>
             <w:r>
-              <w:rPr>
-                <w:sz w:val="20"/>
-                <w:szCs w:val="20"/>
-              </w:rPr>
               <w:t>0.921 (0.921–0.938)</w:t>
             </w:r>
           </w:p>
@@ -5167,10 +4055,6 @@
           </w:tcPr>
           <w:p>
             <w:r>
-              <w:rPr>
-                <w:sz w:val="20"/>
-                <w:szCs w:val="20"/>
-              </w:rPr>
               <w:t>5.530 (0.217–17.151)</w:t>
             </w:r>
           </w:p>
@@ -5181,10 +4065,6 @@
           </w:tcPr>
           <w:p>
             <w:r>
-              <w:rPr>
-                <w:sz w:val="20"/>
-                <w:szCs w:val="20"/>
-              </w:rPr>
               <w:t>0.968 (0.276–1.251)</w:t>
             </w:r>
           </w:p>
@@ -5195,10 +4075,6 @@
           </w:tcPr>
           <w:p>
             <w:r>
-              <w:rPr>
-                <w:sz w:val="20"/>
-                <w:szCs w:val="20"/>
-              </w:rPr>
               <w:t>0.975</w:t>
             </w:r>
           </w:p>
@@ -5209,10 +4085,6 @@
           </w:tcPr>
           <w:p>
             <w:r>
-              <w:rPr>
-                <w:sz w:val="20"/>
-                <w:szCs w:val="20"/>
-              </w:rPr>
               <w:t>0.937</w:t>
             </w:r>
           </w:p>
@@ -5606,35 +4478,51 @@
 
 <file path=word/styles.xml><?xml version="1.0" encoding="utf-8"?>
 <w:styles xmlns:w="http://schemas.openxmlformats.org/wordprocessingml/2006/main">
+  <w:docDefaults>
+    <w:rPrDefault>
+      <w:rPr>
+        <w:rFonts w:ascii="Times New Roman" w:hAnsi="Times New Roman" w:cs="Times New Roman"/>
+        <w:sz w:val="24"/>
+        <w:szCs w:val="24"/>
+      </w:rPr>
+    </w:rPrDefault>
+  </w:docDefaults>
   <w:style w:type="paragraph" w:default="1" w:styleId="Normal">
     <w:name w:val="Normal"/>
     <w:rPr>
-      <w:rFonts w:ascii="Times New Roman" w:hAnsi="Times New Roman"/>
+      <w:rFonts w:ascii="Times New Roman" w:hAnsi="Times New Roman" w:cs="Times New Roman"/>
       <w:sz w:val="24"/>
+      <w:szCs w:val="24"/>
     </w:rPr>
   </w:style>
   <w:style w:type="paragraph" w:styleId="Title">
     <w:name w:val="Title"/>
     <w:basedOn w:val="Normal"/>
     <w:rPr>
+      <w:rFonts w:ascii="Times New Roman" w:hAnsi="Times New Roman" w:cs="Times New Roman"/>
       <w:b/>
-      <w:sz w:val="32"/>
+      <w:sz w:val="36"/>
+      <w:szCs w:val="36"/>
     </w:rPr>
   </w:style>
   <w:style w:type="paragraph" w:styleId="Heading1">
     <w:name w:val="heading 1"/>
     <w:basedOn w:val="Normal"/>
     <w:rPr>
+      <w:rFonts w:ascii="Times New Roman" w:hAnsi="Times New Roman" w:cs="Times New Roman"/>
       <w:b/>
-      <w:sz w:val="28"/>
+      <w:sz w:val="36"/>
+      <w:szCs w:val="36"/>
     </w:rPr>
   </w:style>
   <w:style w:type="paragraph" w:styleId="Heading2">
     <w:name w:val="heading 2"/>
     <w:basedOn w:val="Normal"/>
     <w:rPr>
+      <w:rFonts w:ascii="Times New Roman" w:hAnsi="Times New Roman" w:cs="Times New Roman"/>
       <w:b/>
-      <w:sz w:val="24"/>
+      <w:sz w:val="28"/>
+      <w:szCs w:val="28"/>
     </w:rPr>
   </w:style>
   <w:style w:type="table" w:styleId="TableGrid">

</xml_diff>